<commit_message>
update de la documentation
</commit_message>
<xml_diff>
--- a/Documentation_Site_ED_GEETS.docx
+++ b/Documentation_Site_ED_GEETS.docx
@@ -309,6 +309,46 @@
       </w:pPr>
       <w:r>
         <w:t>Ou aller sur /admin → Se déconnecter</w:t>
+      </w:r>
+    </w:p>
+    <w:p>
+      <w:pPr>
+        <w:pStyle w:val="Normal"/>
+      </w:pPr>
+      <w:r>
+        <w:t xml:space="preserve">Changer le mot de passe</w:t>
+      </w:r>
+    </w:p>
+    <w:p>
+      <w:pPr>
+        <w:pStyle w:val="Normal"/>
+      </w:pPr>
+      <w:r>
+        <w:t xml:space="preserve">Deux scénarios sont possibles :</w:t>
+      </w:r>
+    </w:p>
+    <w:p>
+      <w:pPr>
+        <w:pStyle w:val="ListBullet"/>
+      </w:pPr>
+      <w:r>
+        <w:t xml:space="preserve">Sans être connecté : sur /admin, cliquer sur "Changer le mot de passe" sous le formulaire de login. Saisir le nom d'utilisateur, l'ancien mot de passe et le nouveau. Aucun JWT requis.</w:t>
+      </w:r>
+    </w:p>
+    <w:p>
+      <w:pPr>
+        <w:pStyle w:val="ListBullet"/>
+      </w:pPr>
+      <w:r>
+        <w:t xml:space="preserve">Une fois connecté : section "Réinitialiser le mot de passe" en bas de /admin. Saisir le mot de passe actuel et le nouveau. Requête authentifiée par JWT.</w:t>
+      </w:r>
+    </w:p>
+    <w:p>
+      <w:pPr>
+        <w:pStyle w:val="Normal"/>
+      </w:pPr>
+      <w:r>
+        <w:t xml:space="preserve">Le nouveau mot de passe doit faire au moins 6 caractères dans les deux cas.</w:t>
       </w:r>
     </w:p>
     <w:p>
@@ -1539,6 +1579,90 @@
           <w:p>
             <w:r>
               <w:t>Vérifie la validité du token</w:t>
+            </w:r>
+          </w:p>
+        </w:tc>
+      </w:tr>
+      <w:tr>
+        <w:tc>
+          <w:tcPr>
+            <w:tcW w:type="dxa" w:w="2160"/>
+          </w:tcPr>
+          <w:p>
+            <w:r>
+              <w:t>POST</w:t>
+            </w:r>
+          </w:p>
+        </w:tc>
+        <w:tc>
+          <w:tcPr>
+            <w:tcW w:type="dxa" w:w="2160"/>
+          </w:tcPr>
+          <w:p>
+            <w:r>
+              <w:t>/api/auth/change-password</w:t>
+            </w:r>
+          </w:p>
+        </w:tc>
+        <w:tc>
+          <w:tcPr>
+            <w:tcW w:type="dxa" w:w="2160"/>
+          </w:tcPr>
+          <w:p>
+            <w:r>
+              <w:t>Non</w:t>
+            </w:r>
+          </w:p>
+        </w:tc>
+        <w:tc>
+          <w:tcPr>
+            <w:tcW w:type="dxa" w:w="2160"/>
+          </w:tcPr>
+          <w:p>
+            <w:r>
+              <w:t>Changer le mot de passe avec l'ancien mdp (sans connexion préalable)</w:t>
+            </w:r>
+          </w:p>
+        </w:tc>
+      </w:tr>
+      <w:tr>
+        <w:tc>
+          <w:tcPr>
+            <w:tcW w:type="dxa" w:w="2160"/>
+          </w:tcPr>
+          <w:p>
+            <w:r>
+              <w:t>POST</w:t>
+            </w:r>
+          </w:p>
+        </w:tc>
+        <w:tc>
+          <w:tcPr>
+            <w:tcW w:type="dxa" w:w="2160"/>
+          </w:tcPr>
+          <w:p>
+            <w:r>
+              <w:t>/api/auth/reset-password</w:t>
+            </w:r>
+          </w:p>
+        </w:tc>
+        <w:tc>
+          <w:tcPr>
+            <w:tcW w:type="dxa" w:w="2160"/>
+          </w:tcPr>
+          <w:p>
+            <w:r>
+              <w:t>Oui</w:t>
+            </w:r>
+          </w:p>
+        </w:tc>
+        <w:tc>
+          <w:tcPr>
+            <w:tcW w:type="dxa" w:w="2160"/>
+          </w:tcPr>
+          <w:p>
+            <w:r>
+              <w:t>Changer le mot de passe depuis une session active (JWT requis)</w:t>
             </w:r>
           </w:p>
         </w:tc>

</xml_diff>